<commit_message>
Correct client name to Joseph Thomas Lucero; add address and property ID
- Fixed surname (intake transcript mis-heard 'Lucero' as 'Blusero')
- Contracting party is the individual (Joseph Thomas Lucero, 'Tom'),
  per Steven's call to write it personally rather than to the trust
- Added address: 21181 N 104th Ln, Peoria, AZ 85382
- Identified the trust-held rental ('Shea Haven', in The Joseph Thomas
  Lucero Living Trust) in the scope so record ownership stays clear

Co-Authored-By: Claude Opus 4.8 <noreply@anthropic.com>
Claude-Session: https://claude.ai/code/session_01RfN2m1kgBo1xCWLXRNw2zV
</commit_message>
<xml_diff>
--- a/Onyx_Engagement_Letter_Blusero_HOURLY.docx
+++ b/Onyx_Engagement_Letter_Blusero_HOURLY.docx
@@ -245,7 +245,7 @@
           <w:noProof/>
           <w:color w:val="auto"/>
         </w:rPr>
-        <w:t>Tom Blusero</w:t>
+        <w:t>Joseph Thomas Lucero</w:t>
       </w:r>
       <w:r>
         <w:rPr>
@@ -474,7 +474,7 @@
         <w:rPr>
           <w:noProof/>
         </w:rPr>
-        <w:t>Tom Blusero</w:t>
+        <w:t>Joseph Thomas Lucero</w:t>
       </w:r>
       <w:r>
         <w:fldChar w:fldCharType="end"/>
@@ -487,7 +487,7 @@
       </w:pPr>
       <w:r>
         <w:rPr/>
-        <w:t>[Street address]</w:t>
+        <w:t>21181 N 104th Ln</w:t>
       </w:r>
       <w:bookmarkStart w:id="3" w:name="Text11"/>
       <w:bookmarkEnd w:id="3"/>
@@ -498,7 +498,7 @@
       </w:pPr>
       <w:r>
         <w:rPr/>
-        <w:t>[City, State ZIP]</w:t>
+        <w:t>Peoria, AZ 85382</w:t>
       </w:r>
       <w:bookmarkStart w:id="4" w:name="Text12"/>
       <w:bookmarkEnd w:id="4"/>
@@ -611,7 +611,7 @@
         <w:rPr>
           <w:noProof/>
         </w:rPr>
-        <w:t>Tom Blusero</w:t>
+        <w:t>Joseph Thomas Lucero</w:t>
       </w:r>
       <w:r>
         <w:fldChar w:fldCharType="end"/>
@@ -837,7 +837,7 @@
       </w:pPr>
       <w:r>
         <w:rPr/>
-        <w:t>ONYX will set up your rental property in QuickBooks Online and get the books clean and current from the property’s May 2026 in-service date — then hand you a documented, largely automated process you can run yourself. The work is scoped to this single furnished (30-day-plus) rental, managed by your property-management company, and can be adjusted as your needs change.</w:t>
+        <w:t>ONYX will set up your rental property — a single furnished rental held in The Joseph Thomas Lucero Living Trust, which you refer to as “Shea Haven” — in QuickBooks Online and get the books clean and current from the property’s May 2026 in-service date — then hand you a documented, largely automated process you can run yourself. The work is scoped to this single furnished (30-day-plus) rental, managed by your property-management company, and can be adjusted as your needs change.</w:t>
       </w:r>
     </w:p>
     <w:p>
@@ -3739,7 +3739,7 @@
         <w:rPr>
           <w:noProof/>
         </w:rPr>
-        <w:t>Tom Blusero</w:t>
+        <w:t>Joseph Thomas Lucero</w:t>
       </w:r>
       <w:r>
         <w:fldChar w:fldCharType="end"/>

</xml_diff>